<commit_message>
docs: enrich FAQ with operational challenges and camera photo guidelines
</commit_message>
<xml_diff>
--- a/handover/Midevas_Collection_Owner_Guide.docx
+++ b/handover/Midevas_Collection_Owner_Guide.docx
@@ -1150,6 +1150,57 @@
         <w:t>A: There is a red button in 'Product Catalog' called 'Reset to Factory Catalog'. Tapping it safely restores all 52 original items with clean photos and prices.</w:t>
       </w:r>
     </w:p>
+    <w:p>
+      <w:r>
+        <w:rPr>
+          <w:b/>
+          <w:color w:val="0F172A"/>
+        </w:rPr>
+        <w:t>Q: Can I change product photos with my phone camera?</w:t>
+      </w:r>
+    </w:p>
+    <w:p>
+      <w:pPr>
+        <w:ind w:left="360"/>
+      </w:pPr>
+      <w:r>
+        <w:t>A: Yes! Tap Edit on any product, tap 'Upload File', and snap a photo. Photos are automatically compressed to ~70KB so they load instantly and never run out of space.</w:t>
+      </w:r>
+    </w:p>
+    <w:p>
+      <w:r>
+        <w:rPr>
+          <w:b/>
+          <w:color w:val="0F172A"/>
+        </w:rPr>
+        <w:t>Q: I see an order in the dashboard, but no WhatsApp message arrived?</w:t>
+      </w:r>
+    </w:p>
+    <w:p>
+      <w:pPr>
+        <w:ind w:left="360"/>
+      </w:pPr>
+      <w:r>
+        <w:t>A: The student might have closed WhatsApp before tapping the green send button. Always confirm the actual WhatsApp chat message before walking to the hostel.</w:t>
+      </w:r>
+    </w:p>
+    <w:p>
+      <w:r>
+        <w:rPr>
+          <w:b/>
+          <w:color w:val="0F172A"/>
+        </w:rPr>
+        <w:t>Q: What if a student isn't in their hostel room when I arrive?</w:t>
+      </w:r>
+    </w:p>
+    <w:p>
+      <w:pPr>
+        <w:ind w:left="360"/>
+      </w:pPr>
+      <w:r>
+        <w:t>A: Tap 'WhatsApp Delivery Roster' in your Admin to copy all student numbers. Send a quick WhatsApp 15 minutes before: 'On my way with your order!'</w:t>
+      </w:r>
+    </w:p>
     <w:p/>
     <w:p>
       <w:pPr>

</xml_diff>